<commit_message>
Clean printer UX and sanitize production leaks
</commit_message>
<xml_diff>
--- a/DOCUMENTS/docs/MANUFACTURER_PRINTER_SETUP_GUIDE.docx
+++ b/DOCUMENTS/docs/MANUFACTURER_PRINTER_SETUP_GUIDE.docx
@@ -373,7 +373,7 @@
         <w:spacing w:after="50"/>
       </w:pPr>
       <w:r>
-        <w:t xml:space="preserve">5. Open Printer Diagnostics in MSCQR and verify readiness.</w:t>
+        <w:t xml:space="preserve">5. Open Printer Setup in MSCQR and verify readiness.</w:t>
       </w:r>
     </w:p>
     <w:p>
@@ -413,7 +413,7 @@
         <w:spacing w:after="80"/>
       </w:pPr>
       <w:r>
-        <w:t xml:space="preserve">In Printer Diagnostics:</w:t>
+        <w:t xml:space="preserve">In Printer Setup:</w:t>
       </w:r>
     </w:p>
     <w:p>
@@ -458,7 +458,7 @@
         <w:spacing w:after="50"/>
       </w:pPr>
       <w:r>
-        <w:t xml:space="preserve">5. Save and run Test.</w:t>
+        <w:t xml:space="preserve">5. Save and run Check.</w:t>
       </w:r>
     </w:p>
     <w:p>
@@ -493,7 +493,7 @@
         <w:spacing w:after="80"/>
       </w:pPr>
       <w:r>
-        <w:t xml:space="preserve">In Printer Diagnostics:</w:t>
+        <w:t xml:space="preserve">In Printer Setup:</w:t>
       </w:r>
     </w:p>
     <w:p>
@@ -546,7 +546,7 @@
         <w:spacing w:after="50"/>
       </w:pPr>
       <w:r>
-        <w:t xml:space="preserve">6. Save and run Test.</w:t>
+        <w:t xml:space="preserve">6. Save and run Check.</w:t>
       </w:r>
     </w:p>
     <w:p>
@@ -755,7 +755,7 @@
         <w:spacing w:after="50"/>
       </w:pPr>
       <w:r>
-        <w:t xml:space="preserve">6. Return to Printer Diagnostics and verify the profile changes to Site gateway online.</w:t>
+        <w:t xml:space="preserve">6. Return to Printer Setup and verify the profile changes to Site gateway online.</w:t>
       </w:r>
     </w:p>
     <w:p>
@@ -803,7 +803,7 @@
         <w:spacing w:after="50"/>
       </w:pPr>
       <w:r>
-        <w:t xml:space="preserve">2. The correct dispatch mode appears in the print dialog.</w:t>
+        <w:t xml:space="preserve">2. The correct saved printer appears in the print dialog.</w:t>
       </w:r>
     </w:p>
     <w:p>
@@ -867,15 +867,15 @@
         <w:spacing w:after="50"/>
       </w:pPr>
       <w:r>
-        <w:t xml:space="preserve">1. Open Printer Diagnostics.</w:t>
-      </w:r>
-    </w:p>
-    <w:p>
-      <w:pPr>
-        <w:spacing w:after="50"/>
-      </w:pPr>
-      <w:r>
-        <w:t xml:space="preserve">2. Copy the diagnostic snapshot.</w:t>
+        <w:t xml:space="preserve">1. Open Printer Setup.</w:t>
+      </w:r>
+    </w:p>
+    <w:p>
+      <w:pPr>
+        <w:spacing w:after="50"/>
+      </w:pPr>
+      <w:r>
+        <w:t xml:space="preserve">2. Copy the support summary.</w:t>
       </w:r>
     </w:p>
     <w:p>
@@ -891,7 +891,7 @@
         <w:spacing w:after="50"/>
       </w:pPr>
       <w:r>
-        <w:t xml:space="preserve">4. Confirm whether the issue is local workstation, network reachability, IPP validation, or gateway heartbeat.</w:t>
+        <w:t xml:space="preserve">4. Confirm whether the issue is workstation availability, network reachability, IPP validation, or site connector availability.</w:t>
       </w:r>
     </w:p>
     <w:p>

</xml_diff>